<commit_message>
Add detailed descriptions and SQL examples for consumption layer mart views in EvidenceDocument
</commit_message>
<xml_diff>
--- a/Data Pipeline Exercise/evidence/EvidenceDocument.docx
+++ b/Data Pipeline Exercise/evidence/EvidenceDocument.docx
@@ -639,8 +639,6 @@
         </w:rPr>
         <w:t xml:space="preserve">Adf Pipeline run succes full end to end </w:t>
       </w:r>
-      <w:bookmarkStart w:id="0" w:name="_GoBack"/>
-      <w:bookmarkEnd w:id="0"/>
       <w:r>
         <w:rPr>
           <w:rFonts w:hint="default"/>
@@ -2567,6 +2565,487 @@
           <w:lang w:val="en-IN"/>
         </w:rPr>
         <w:br w:type="textWrapping"/>
+      </w:r>
+    </w:p>
+    <w:p>
+      <w:pPr>
+        <w:rPr>
+          <w:rFonts w:hint="default"/>
+          <w:lang w:val="en-IN"/>
+        </w:rPr>
+      </w:pPr>
+      <w:r>
+        <w:rPr>
+          <w:rFonts w:hint="default"/>
+          <w:lang w:val="en-IN"/>
+        </w:rPr>
+        <w:t>Consumption layer — mart views</w:t>
+      </w:r>
+    </w:p>
+    <w:p>
+      <w:pPr>
+        <w:rPr>
+          <w:rFonts w:hint="default"/>
+          <w:lang w:val="en-IN"/>
+        </w:rPr>
+      </w:pPr>
+    </w:p>
+    <w:p>
+      <w:pPr>
+        <w:rPr>
+          <w:rFonts w:hint="default"/>
+          <w:lang w:val="en-IN"/>
+        </w:rPr>
+      </w:pPr>
+      <w:r>
+        <w:rPr>
+          <w:rFonts w:hint="default"/>
+          <w:lang w:val="en-IN"/>
+        </w:rPr>
+        <w:t>The mart schema is the proof that both source systems (relational Postgres + file-based CSVs) come together as one integrated, analytically-queryable dataset — not just two independently-loaded tables sitting side by side.</w:t>
+      </w:r>
+    </w:p>
+    <w:p>
+      <w:pPr>
+        <w:rPr>
+          <w:rFonts w:hint="default"/>
+          <w:lang w:val="en-IN"/>
+        </w:rPr>
+      </w:pPr>
+    </w:p>
+    <w:p>
+      <w:pPr>
+        <w:rPr>
+          <w:rFonts w:hint="default"/>
+          <w:lang w:val="en-IN"/>
+        </w:rPr>
+      </w:pPr>
+      <w:r>
+        <w:rPr>
+          <w:rFonts w:hint="default"/>
+          <w:lang w:val="en-IN"/>
+        </w:rPr>
+        <w:t>v_sales_overview — order count, gross merchandise value, and average delivery time broken down by customer state × product category. This single view joins across all four transactional entities (orders, customers, order_items, products) plus the category-name translation lookup, restricted to delivered orders with valid delivery dates.</w:t>
+      </w:r>
+    </w:p>
+    <w:p>
+      <w:pPr>
+        <w:rPr>
+          <w:rFonts w:hint="default"/>
+          <w:lang w:val="en-IN"/>
+        </w:rPr>
+      </w:pPr>
+      <w:r>
+        <w:rPr>
+          <w:rFonts w:hint="default"/>
+          <w:lang w:val="en-IN"/>
+        </w:rPr>
+        <w:t>v_payment_mix — how customers pay: order coverage, total value, and average installment count per payment type, with each type's share of total revenue. Built from order_payments filtered to DQ-valid rows only (excludes the 3 not_defined payment types flagged, not silently dropped).</w:t>
+      </w:r>
+    </w:p>
+    <w:p>
+      <w:pPr>
+        <w:rPr>
+          <w:rFonts w:hint="default"/>
+          <w:lang w:val="en-IN"/>
+        </w:rPr>
+      </w:pPr>
+      <w:r>
+        <w:rPr>
+          <w:rFonts w:hint="default"/>
+          <w:lang w:val="en-IN"/>
+        </w:rPr>
+        <w:t>v_review_delivery — review score against delivery performance: average delivery days and percentage of orders delivered after the estimated date, grouped by star rating.</w:t>
+      </w:r>
+      <w:r>
+        <w:rPr>
+          <w:rFonts w:hint="default"/>
+          <w:lang w:val="en-IN"/>
+        </w:rPr>
+        <w:br w:type="textWrapping"/>
+      </w:r>
+      <w:r>
+        <w:rPr>
+          <w:rFonts w:hint="default"/>
+          <w:lang w:val="en-IN"/>
+        </w:rPr>
+        <w:br w:type="textWrapping"/>
+      </w:r>
+      <w:r>
+        <w:rPr>
+          <w:rFonts w:hint="default"/>
+          <w:lang w:val="en-IN"/>
+        </w:rPr>
+        <w:br w:type="textWrapping"/>
+      </w:r>
+      <w:r>
+        <w:rPr>
+          <w:rFonts w:hint="default"/>
+          <w:lang w:val="en-IN"/>
+        </w:rPr>
+        <w:br w:type="textWrapping"/>
+      </w:r>
+      <w:r>
+        <w:rPr>
+          <w:rFonts w:hint="default"/>
+          <w:lang w:val="en-IN"/>
+        </w:rPr>
+        <w:t>The mart: both source systems integrated and analytically usable</w:t>
+      </w:r>
+      <w:r>
+        <w:rPr>
+          <w:rFonts w:hint="default"/>
+          <w:lang w:val="en-IN"/>
+        </w:rPr>
+        <w:br w:type="textWrapping"/>
+      </w:r>
+    </w:p>
+    <w:p>
+      <w:pPr>
+        <w:rPr>
+          <w:rFonts w:hint="default"/>
+          <w:lang w:val="en-IN"/>
+        </w:rPr>
+      </w:pPr>
+      <w:r>
+        <w:rPr>
+          <w:rFonts w:hint="default"/>
+          <w:lang w:val="en-IN"/>
+        </w:rPr>
+        <w:t xml:space="preserve"> Sales overview (now with English category names via the translation</w:t>
+      </w:r>
+    </w:p>
+    <w:p>
+      <w:pPr>
+        <w:rPr>
+          <w:rFonts w:hint="default"/>
+          <w:lang w:val="en-IN"/>
+        </w:rPr>
+      </w:pPr>
+      <w:r>
+        <w:rPr>
+          <w:rFonts w:hint="default"/>
+          <w:lang w:val="en-IN"/>
+        </w:rPr>
+        <w:t>- lookup; 'unknown' and untranslated categories fall back to Portuguese)</w:t>
+      </w:r>
+      <w:r>
+        <w:rPr>
+          <w:rFonts w:hint="default"/>
+          <w:lang w:val="en-IN"/>
+        </w:rPr>
+        <w:br w:type="textWrapping"/>
+      </w:r>
+    </w:p>
+    <w:p>
+      <w:pPr>
+        <w:rPr>
+          <w:rFonts w:hint="default"/>
+          <w:lang w:val="en-IN"/>
+        </w:rPr>
+      </w:pPr>
+      <w:r>
+        <w:rPr>
+          <w:rFonts w:hint="default"/>
+          <w:lang w:val="en-IN"/>
+        </w:rPr>
+        <w:t>SELECT TOP 10 customer_state, product_category,</w:t>
+      </w:r>
+    </w:p>
+    <w:p>
+      <w:pPr>
+        <w:rPr>
+          <w:rFonts w:hint="default"/>
+          <w:lang w:val="en-IN"/>
+        </w:rPr>
+      </w:pPr>
+      <w:r>
+        <w:rPr>
+          <w:rFonts w:hint="default"/>
+          <w:lang w:val="en-IN"/>
+        </w:rPr>
+        <w:t xml:space="preserve">       order_count, gross_merchandise_value, avg_delivery_days</w:t>
+      </w:r>
+    </w:p>
+    <w:p>
+      <w:pPr>
+        <w:rPr>
+          <w:rFonts w:hint="default"/>
+          <w:lang w:val="en-IN"/>
+        </w:rPr>
+      </w:pPr>
+      <w:r>
+        <w:rPr>
+          <w:rFonts w:hint="default"/>
+          <w:lang w:val="en-IN"/>
+        </w:rPr>
+        <w:t>FROM mart.v_sales_overview</w:t>
+      </w:r>
+    </w:p>
+    <w:p>
+      <w:pPr>
+        <w:rPr>
+          <w:rFonts w:hint="default"/>
+          <w:lang w:val="en-IN"/>
+        </w:rPr>
+      </w:pPr>
+      <w:r>
+        <w:rPr>
+          <w:rFonts w:hint="default"/>
+          <w:lang w:val="en-IN"/>
+        </w:rPr>
+        <w:t>ORDER BY order_count DESC;</w:t>
+      </w:r>
+    </w:p>
+    <w:p>
+      <w:pPr>
+        <w:rPr>
+          <w:rFonts w:hint="default"/>
+          <w:lang w:val="en-IN"/>
+        </w:rPr>
+      </w:pPr>
+      <w:r>
+        <w:drawing>
+          <wp:inline distT="0" distB="0" distL="114300" distR="114300">
+            <wp:extent cx="5273675" cy="2064385"/>
+            <wp:effectExtent l="0" t="0" r="14605" b="8255"/>
+            <wp:docPr id="14" name="Picture 14"/>
+            <wp:cNvGraphicFramePr>
+              <a:graphicFrameLocks xmlns:a="http://schemas.openxmlformats.org/drawingml/2006/main" noChangeAspect="1"/>
+            </wp:cNvGraphicFramePr>
+            <a:graphic xmlns:a="http://schemas.openxmlformats.org/drawingml/2006/main">
+              <a:graphicData uri="http://schemas.openxmlformats.org/drawingml/2006/picture">
+                <pic:pic xmlns:pic="http://schemas.openxmlformats.org/drawingml/2006/picture">
+                  <pic:nvPicPr>
+                    <pic:cNvPr id="14" name="Picture 14"/>
+                    <pic:cNvPicPr>
+                      <a:picLocks noChangeAspect="1"/>
+                    </pic:cNvPicPr>
+                  </pic:nvPicPr>
+                  <pic:blipFill>
+                    <a:blip r:embed="rId16"/>
+                    <a:stretch>
+                      <a:fillRect/>
+                    </a:stretch>
+                  </pic:blipFill>
+                  <pic:spPr>
+                    <a:xfrm>
+                      <a:off x="0" y="0"/>
+                      <a:ext cx="5273675" cy="2064385"/>
+                    </a:xfrm>
+                    <a:prstGeom prst="rect">
+                      <a:avLst/>
+                    </a:prstGeom>
+                    <a:noFill/>
+                    <a:ln>
+                      <a:noFill/>
+                    </a:ln>
+                  </pic:spPr>
+                </pic:pic>
+              </a:graphicData>
+            </a:graphic>
+          </wp:inline>
+        </w:drawing>
+      </w:r>
+      <w:r>
+        <w:br w:type="textWrapping"/>
+      </w:r>
+      <w:r>
+        <w:br w:type="textWrapping"/>
+      </w:r>
+      <w:r>
+        <w:br w:type="textWrapping"/>
+      </w:r>
+    </w:p>
+    <w:p>
+      <w:pPr>
+        <w:rPr>
+          <w:rFonts w:hint="default"/>
+          <w:lang w:val="en-IN"/>
+        </w:rPr>
+      </w:pPr>
+      <w:r>
+        <w:rPr>
+          <w:rFonts w:hint="default"/>
+          <w:lang w:val="en-IN"/>
+        </w:rPr>
+        <w:t xml:space="preserve"> Payment mix (full output — 4 rows)</w:t>
+      </w:r>
+    </w:p>
+    <w:p>
+      <w:pPr>
+        <w:rPr>
+          <w:rFonts w:hint="default"/>
+          <w:lang w:val="en-IN"/>
+        </w:rPr>
+      </w:pPr>
+      <w:r>
+        <w:rPr>
+          <w:rFonts w:hint="default"/>
+          <w:lang w:val="en-IN"/>
+        </w:rPr>
+        <w:t>SELECT * FROM mart.v_payment_mix ORDER BY total_payment_value DESC;</w:t>
+      </w:r>
+    </w:p>
+    <w:p>
+      <w:pPr>
+        <w:rPr>
+          <w:rFonts w:hint="default"/>
+          <w:lang w:val="en-IN"/>
+        </w:rPr>
+      </w:pPr>
+      <w:r>
+        <w:rPr>
+          <w:rFonts w:hint="default"/>
+          <w:lang w:val="en-IN"/>
+        </w:rPr>
+        <w:br w:type="textWrapping"/>
+      </w:r>
+      <w:r>
+        <w:rPr>
+          <w:rFonts w:hint="default"/>
+          <w:lang w:val="en-IN"/>
+        </w:rPr>
+        <w:br w:type="textWrapping"/>
+      </w:r>
+      <w:r>
+        <w:drawing>
+          <wp:inline distT="0" distB="0" distL="114300" distR="114300">
+            <wp:extent cx="5269230" cy="2235835"/>
+            <wp:effectExtent l="0" t="0" r="3810" b="4445"/>
+            <wp:docPr id="15" name="Picture 15"/>
+            <wp:cNvGraphicFramePr>
+              <a:graphicFrameLocks xmlns:a="http://schemas.openxmlformats.org/drawingml/2006/main" noChangeAspect="1"/>
+            </wp:cNvGraphicFramePr>
+            <a:graphic xmlns:a="http://schemas.openxmlformats.org/drawingml/2006/main">
+              <a:graphicData uri="http://schemas.openxmlformats.org/drawingml/2006/picture">
+                <pic:pic xmlns:pic="http://schemas.openxmlformats.org/drawingml/2006/picture">
+                  <pic:nvPicPr>
+                    <pic:cNvPr id="15" name="Picture 15"/>
+                    <pic:cNvPicPr>
+                      <a:picLocks noChangeAspect="1"/>
+                    </pic:cNvPicPr>
+                  </pic:nvPicPr>
+                  <pic:blipFill>
+                    <a:blip r:embed="rId17"/>
+                    <a:stretch>
+                      <a:fillRect/>
+                    </a:stretch>
+                  </pic:blipFill>
+                  <pic:spPr>
+                    <a:xfrm>
+                      <a:off x="0" y="0"/>
+                      <a:ext cx="5269230" cy="2235835"/>
+                    </a:xfrm>
+                    <a:prstGeom prst="rect">
+                      <a:avLst/>
+                    </a:prstGeom>
+                    <a:noFill/>
+                    <a:ln>
+                      <a:noFill/>
+                    </a:ln>
+                  </pic:spPr>
+                </pic:pic>
+              </a:graphicData>
+            </a:graphic>
+          </wp:inline>
+        </w:drawing>
+      </w:r>
+      <w:r>
+        <w:rPr>
+          <w:rFonts w:hint="default"/>
+          <w:lang w:val="en-IN"/>
+        </w:rPr>
+        <w:t>. Review score vs delivery performance (full output — 5 rows;</w:t>
+      </w:r>
+    </w:p>
+    <w:p>
+      <w:pPr>
+        <w:rPr>
+          <w:rFonts w:hint="default"/>
+          <w:lang w:val="en-IN"/>
+        </w:rPr>
+      </w:pPr>
+      <w:bookmarkStart w:id="0" w:name="_GoBack"/>
+      <w:bookmarkEnd w:id="0"/>
+      <w:r>
+        <w:rPr>
+          <w:rFonts w:hint="default"/>
+          <w:lang w:val="en-IN"/>
+        </w:rPr>
+        <w:t>expect avg_delivery_days and pct_delivered_late to fall as score rises)</w:t>
+      </w:r>
+    </w:p>
+    <w:p>
+      <w:pPr>
+        <w:rPr>
+          <w:rFonts w:hint="default"/>
+          <w:lang w:val="en-IN"/>
+        </w:rPr>
+      </w:pPr>
+      <w:r>
+        <w:rPr>
+          <w:rFonts w:hint="default"/>
+          <w:lang w:val="en-IN"/>
+        </w:rPr>
+        <w:t>SELECT * FROM mart.v_review_delivery ORDER BY review_score;</w:t>
+      </w:r>
+      <w:r>
+        <w:rPr>
+          <w:rFonts w:hint="default"/>
+          <w:lang w:val="en-IN"/>
+        </w:rPr>
+        <w:br w:type="textWrapping"/>
+      </w:r>
+      <w:r>
+        <w:rPr>
+          <w:rFonts w:hint="default"/>
+          <w:lang w:val="en-IN"/>
+        </w:rPr>
+        <w:br w:type="textWrapping"/>
+      </w:r>
+      <w:r>
+        <w:drawing>
+          <wp:inline distT="0" distB="0" distL="114300" distR="114300">
+            <wp:extent cx="5266690" cy="2432050"/>
+            <wp:effectExtent l="0" t="0" r="6350" b="6350"/>
+            <wp:docPr id="16" name="Picture 16"/>
+            <wp:cNvGraphicFramePr>
+              <a:graphicFrameLocks xmlns:a="http://schemas.openxmlformats.org/drawingml/2006/main" noChangeAspect="1"/>
+            </wp:cNvGraphicFramePr>
+            <a:graphic xmlns:a="http://schemas.openxmlformats.org/drawingml/2006/main">
+              <a:graphicData uri="http://schemas.openxmlformats.org/drawingml/2006/picture">
+                <pic:pic xmlns:pic="http://schemas.openxmlformats.org/drawingml/2006/picture">
+                  <pic:nvPicPr>
+                    <pic:cNvPr id="16" name="Picture 16"/>
+                    <pic:cNvPicPr>
+                      <a:picLocks noChangeAspect="1"/>
+                    </pic:cNvPicPr>
+                  </pic:nvPicPr>
+                  <pic:blipFill>
+                    <a:blip r:embed="rId18"/>
+                    <a:stretch>
+                      <a:fillRect/>
+                    </a:stretch>
+                  </pic:blipFill>
+                  <pic:spPr>
+                    <a:xfrm>
+                      <a:off x="0" y="0"/>
+                      <a:ext cx="5266690" cy="2432050"/>
+                    </a:xfrm>
+                    <a:prstGeom prst="rect">
+                      <a:avLst/>
+                    </a:prstGeom>
+                    <a:noFill/>
+                    <a:ln>
+                      <a:noFill/>
+                    </a:ln>
+                  </pic:spPr>
+                </pic:pic>
+              </a:graphicData>
+            </a:graphic>
+          </wp:inline>
+        </w:drawing>
       </w:r>
     </w:p>
     <w:sectPr>

</xml_diff>